<commit_message>
runbook: correct the Windows detached-launch method (single-arg Start-Process) + add the one-agent-at-a-time policy-name-uniqueness finding
</commit_message>
<xml_diff>
--- a/docs/Benefits-AgentCore-SA-Runbook.docx
+++ b/docs/Benefits-AgentCore-SA-Runbook.docx
@@ -3945,6 +3945,119 @@
         <w:t xml:space="preserve">aws stepfunctions stop-execution --execution-arn &lt;arn&gt; --region us-east-1   # then redeploy</w:t>
       </w:r>
     </w:p>
+    <w:tbl>
+      <w:tblPr>
+        <w:tblW w:type="pct" w:w="100%"/>
+        <w:tblBorders>
+          <w:top w:val="single" w:color="B9791F" w:sz="2"/>
+          <w:left w:val="single" w:color="B9791F" w:sz="18"/>
+          <w:bottom w:val="single" w:color="B9791F" w:sz="2"/>
+          <w:right w:val="single" w:color="B9791F" w:sz="2"/>
+          <w:insideH w:val="none"/>
+          <w:insideV w:val="none"/>
+        </w:tblBorders>
+      </w:tblPr>
+      <w:tblGrid>
+        <w:gridCol w:w="10440"/>
+      </w:tblGrid>
+      <w:tr>
+        <w:tc>
+          <w:tcPr>
+            <w:tcW w:type="dxa" w:w="10440"/>
+            <w:shd w:fill="FBF3E7" w:val="clear"/>
+            <w:tcMar>
+              <w:top w:type="dxa" w:w="120"/>
+              <w:left w:type="dxa" w:w="180"/>
+              <w:bottom w:type="dxa" w:w="120"/>
+              <w:right w:type="dxa" w:w="180"/>
+            </w:tcMar>
+          </w:tcPr>
+          <w:p>
+            <w:pPr>
+              <w:spacing w:after="40"/>
+            </w:pPr>
+            <w:r>
+              <w:rPr>
+                <w:b/>
+                <w:bCs/>
+                <w:color w:val="B9791F"/>
+                <w:sz w:val="20"/>
+                <w:szCs w:val="20"/>
+              </w:rPr>
+              <w:t xml:space="preserve">One template agent live at a time (per account/region)</w:t>
+            </w:r>
+          </w:p>
+          <w:p>
+            <w:pPr>
+              <w:spacing w:after="20" w:line="258"/>
+            </w:pPr>
+            <w:r>
+              <w:t xml:space="preserve">AgentCore Policy names are unique per account/region, and the template agents share several policy names (</w:t>
+            </w:r>
+            <w:r>
+              <w:rPr>
+                <w:rFonts w:ascii="Consolas" w:cs="Consolas" w:eastAsia="Consolas" w:hAnsi="Consolas"/>
+                <w:color w:val="1B3A2B"/>
+                <w:sz w:val="18"/>
+                <w:szCs w:val="18"/>
+              </w:rPr>
+              <w:t xml:space="preserve">mask_before_assess</w:t>
+            </w:r>
+            <w:r>
+              <w:t xml:space="preserve">, </w:t>
+            </w:r>
+            <w:r>
+              <w:rPr>
+                <w:rFonts w:ascii="Consolas" w:cs="Consolas" w:eastAsia="Consolas" w:hAnsi="Consolas"/>
+                <w:color w:val="1B3A2B"/>
+                <w:sz w:val="18"/>
+                <w:szCs w:val="18"/>
+              </w:rPr>
+              <w:t xml:space="preserve">mask_before_draft</w:t>
+            </w:r>
+            <w:r>
+              <w:t xml:space="preserve">, </w:t>
+            </w:r>
+            <w:r>
+              <w:rPr>
+                <w:rFonts w:ascii="Consolas" w:cs="Consolas" w:eastAsia="Consolas" w:hAnsi="Consolas"/>
+                <w:color w:val="1B3A2B"/>
+                <w:sz w:val="18"/>
+                <w:szCs w:val="18"/>
+              </w:rPr>
+              <w:t xml:space="preserve">no_self_commit</w:t>
+            </w:r>
+            <w:r>
+              <w:t xml:space="preserve">). Deploying a second template agent while another is live fails with </w:t>
+            </w:r>
+            <w:r>
+              <w:rPr>
+                <w:rFonts w:ascii="Consolas" w:cs="Consolas" w:eastAsia="Consolas" w:hAnsi="Consolas"/>
+                <w:color w:val="1B3A2B"/>
+                <w:sz w:val="18"/>
+                <w:szCs w:val="18"/>
+              </w:rPr>
+              <w:t xml:space="preserve">ConflictException … Policy with the same name already exists</w:t>
+            </w:r>
+            <w:r>
+              <w:t xml:space="preserve"> on the shared names — and because the agent-specific permit is created first, this can leave a partial spine that must be torn down. Deploy and validate one agent at a time (run </w:t>
+            </w:r>
+            <w:r>
+              <w:rPr>
+                <w:rFonts w:ascii="Consolas" w:cs="Consolas" w:eastAsia="Consolas" w:hAnsi="Consolas"/>
+                <w:color w:val="1B3A2B"/>
+                <w:sz w:val="18"/>
+                <w:szCs w:val="18"/>
+              </w:rPr>
+              <w:t xml:space="preserve">destroy.sh</w:t>
+            </w:r>
+            <w:r>
+              <w:t xml:space="preserve"> for the live agent before deploying the next), or prefix the policy names per agent so multiple agents can coexist.</w:t>
+            </w:r>
+          </w:p>
+        </w:tc>
+      </w:tr>
+    </w:tbl>
     <w:p>
       <w:pPr>
         <w:pStyle w:val="Heading1"/>
@@ -4028,10 +4141,22 @@
           <w:b/>
           <w:bCs/>
         </w:rPr>
-        <w:t xml:space="preserve">Detached long runs — wrap bash in cmd.exe. </w:t>
-      </w:r>
-      <w:r>
-        <w:t xml:space="preserve">The 3–4 minute deploy, the venv build, and the CodeBuild launch must run detached, or a foreground shell can be killed on timeout before they finish. The pattern that works: write a tiny runner (</w:t>
+        <w:t xml:space="preserve">Detached long runs — Start-Process with a single-argument runner. </w:t>
+      </w:r>
+      <w:r>
+        <w:t xml:space="preserve">The 3–4 minute deploy, the venv build, and the CodeBuild launch must run detached, or a foreground shell can be killed on a timeout before they finish. The pattern that works: write a tiny runner script that self-logs and changes into the no-space dir — its first lines are </w:t>
+      </w:r>
+      <w:r>
+        <w:rPr>
+          <w:rFonts w:ascii="Consolas" w:cs="Consolas" w:eastAsia="Consolas" w:hAnsi="Consolas"/>
+          <w:color w:val="1B3A2B"/>
+          <w:sz w:val="18"/>
+          <w:szCs w:val="18"/>
+        </w:rPr>
+        <w:t xml:space="preserve">exec &gt; run.log 2&gt;&amp;1</w:t>
+      </w:r>
+      <w:r>
+        <w:t xml:space="preserve">, then </w:t>
       </w:r>
       <w:r>
         <w:rPr>
@@ -4043,55 +4168,63 @@
         <w:t xml:space="preserve">cd &lt;no-space dir&gt;</w:t>
       </w:r>
       <w:r>
-        <w:t xml:space="preserve"> then the command) and launch </w:t>
-      </w:r>
-      <w:r>
-        <w:rPr>
-          <w:rFonts w:ascii="Consolas" w:cs="Consolas" w:eastAsia="Consolas" w:hAnsi="Consolas"/>
-          <w:color w:val="1B3A2B"/>
-          <w:sz w:val="18"/>
-          <w:szCs w:val="18"/>
-        </w:rPr>
-        <w:t xml:space="preserve">Start-Process cmd.exe -ArgumentList '/c','"…\bash.exe" -l runner.sh &gt; x.log 2&gt;&amp;1' -WorkingDirectory &lt;dir&gt; -WindowStyle Hidden</w:t>
-      </w:r>
-      <w:r>
-        <w:t xml:space="preserve">, then poll </w:t>
-      </w:r>
-      <w:r>
-        <w:rPr>
-          <w:rFonts w:ascii="Consolas" w:cs="Consolas" w:eastAsia="Consolas" w:hAnsi="Consolas"/>
-          <w:color w:val="1B3A2B"/>
-          <w:sz w:val="18"/>
-          <w:szCs w:val="18"/>
-        </w:rPr>
-        <w:t xml:space="preserve">x.log</w:t>
-      </w:r>
-      <w:r>
-        <w:t xml:space="preserve">. Launching </w:t>
-      </w:r>
-      <w:r>
-        <w:rPr>
-          <w:rFonts w:ascii="Consolas" w:cs="Consolas" w:eastAsia="Consolas" w:hAnsi="Consolas"/>
-          <w:color w:val="1B3A2B"/>
-          <w:sz w:val="18"/>
-          <w:szCs w:val="18"/>
-        </w:rPr>
-        <w:t xml:space="preserve">Start-Process bash.exe</w:t>
-      </w:r>
-      <w:r>
-        <w:t xml:space="preserve"> directly does not reliably start; wrap it in </w:t>
-      </w:r>
-      <w:r>
-        <w:rPr>
-          <w:rFonts w:ascii="Consolas" w:cs="Consolas" w:eastAsia="Consolas" w:hAnsi="Consolas"/>
-          <w:color w:val="1B3A2B"/>
-          <w:sz w:val="18"/>
-          <w:szCs w:val="18"/>
-        </w:rPr>
-        <w:t xml:space="preserve">cmd.exe /c</w:t>
-      </w:r>
-      <w:r>
-        <w:t xml:space="preserve">.</w:t>
+        <w:t xml:space="preserve">, then the command — and launch it with </w:t>
+      </w:r>
+      <w:r>
+        <w:rPr>
+          <w:rFonts w:ascii="Consolas" w:cs="Consolas" w:eastAsia="Consolas" w:hAnsi="Consolas"/>
+          <w:color w:val="1B3A2B"/>
+          <w:sz w:val="18"/>
+          <w:szCs w:val="18"/>
+        </w:rPr>
+        <w:t xml:space="preserve">Start-Process -FilePath 'C:\Program Files\Git\bin\bash.exe' -ArgumentList '/c/…/runner.sh' -WindowStyle Hidden</w:t>
+      </w:r>
+      <w:r>
+        <w:t xml:space="preserve">. Pass the runner path as </w:t>
+      </w:r>
+      <w:r>
+        <w:rPr>
+          <w:b/>
+          <w:bCs/>
+        </w:rPr>
+        <w:t xml:space="preserve">one space-free argument</w:t>
+      </w:r>
+      <w:r>
+        <w:t xml:space="preserve">: PowerShell's </w:t>
+      </w:r>
+      <w:r>
+        <w:rPr>
+          <w:rFonts w:ascii="Consolas" w:cs="Consolas" w:eastAsia="Consolas" w:hAnsi="Consolas"/>
+          <w:color w:val="1B3A2B"/>
+          <w:sz w:val="18"/>
+          <w:szCs w:val="18"/>
+        </w:rPr>
+        <w:t xml:space="preserve">-ArgumentList</w:t>
+      </w:r>
+      <w:r>
+        <w:t xml:space="preserve"> joins a multi-token array unquoted, so </w:t>
+      </w:r>
+      <w:r>
+        <w:rPr>
+          <w:rFonts w:ascii="Consolas" w:cs="Consolas" w:eastAsia="Consolas" w:hAnsi="Consolas"/>
+          <w:color w:val="1B3A2B"/>
+          <w:sz w:val="18"/>
+          <w:szCs w:val="18"/>
+        </w:rPr>
+        <w:t xml:space="preserve">'-lc','bash /c/…/runner.sh'</w:t>
+      </w:r>
+      <w:r>
+        <w:t xml:space="preserve"> silently drops the command at the space and the process exits doing nothing. Then verify progress by </w:t>
+      </w:r>
+      <w:r>
+        <w:rPr>
+          <w:b/>
+          <w:bCs/>
+        </w:rPr>
+        <w:t xml:space="preserve">polling AWS state</w:t>
+      </w:r>
+      <w:r>
+        <w:t xml:space="preserve"> (list the gateway/lambdas/policies) — the runner's log is block-buffered to a file, so an empty log does not mean no progress; query the resources.</w:t>
       </w:r>
     </w:p>
     <w:p>

</xml_diff>